<commit_message>
Fix merge: fully take this branch's version for files the auto-merge blended
The -X ours merge auto-resolved actual conflicts in favor of this branch,
but for files where both branches had non-overlapping line-level changes
(workflow_generate.py, mentions_loader.js, accounting/operations/sales.html,
SOP_Content_Notepad.docx), git merged them textually instead -- producing a
hybrid of this branch's per-step Future Procedures column and PR #1's older
current_future-based implementation side by side in the same functions.

Restored this branch's clean versions of all 6 affected files, then did a
full regenerate + validate + browser check to confirm no cross-contamination
between tabs.

Co-Authored-By: Claude Sonnet 5 <noreply@anthropic.com>
</commit_message>
<xml_diff>
--- a/SOP_Content_Notepad.docx
+++ b/SOP_Content_Notepad.docx
@@ -2271,128 +2271,122 @@
         <w:t>Current vs. Future Workflow</w:t>
       </w:r>
     </w:p>
-    <w:tbl>
-      <w:tblPr>
-        <w:tblStyle w:val="TableGrid"/>
-        <w:tblW w:type="auto" w:w="0"/>
-        <w:tblLayout w:type="autofit"/>
-        <w:tblLook w:firstColumn="1" w:firstRow="1" w:lastColumn="0" w:lastRow="0" w:noHBand="0" w:noVBand="1" w:val="04A0"/>
-      </w:tblPr>
-      <w:tblGrid>
-        <w:gridCol w:w="4320"/>
-        <w:gridCol w:w="4320"/>
-      </w:tblGrid>
-      <w:tr>
-        <w:tc>
-          <w:tcPr>
-            <w:tcW w:type="dxa" w:w="4320"/>
-            <w:shd w:val="clear" w:color="auto" w:fill="DCEAF5"/>
-          </w:tcPr>
-          <w:p>
-            <w:r/>
-            <w:r>
-              <w:rPr>
-                <w:b/>
-              </w:rPr>
-              <w:t>Current Workflow</w:t>
-            </w:r>
-          </w:p>
-        </w:tc>
-        <w:tc>
-          <w:tcPr>
-            <w:tcW w:type="dxa" w:w="4320"/>
-            <w:shd w:val="clear" w:color="auto" w:fill="DCEAF5"/>
-          </w:tcPr>
-          <w:p>
-            <w:r/>
-            <w:r>
-              <w:rPr>
-                <w:b/>
-              </w:rPr>
-              <w:t>Future Workflow</w:t>
-            </w:r>
-          </w:p>
-        </w:tc>
-      </w:tr>
-      <w:tr>
-        <w:tc>
-          <w:tcPr>
-            <w:tcW w:type="dxa" w:w="4320"/>
-          </w:tcPr>
-          <w:p>
-            <w:r/>
-            <w:r>
-              <w:rPr>
-                <w:sz w:val="20"/>
-              </w:rPr>
-              <w:t>• Paper DR/CR forms filled by hand at warehouse and client site.</w:t>
-            </w:r>
-          </w:p>
-          <w:p>
-            <w:r>
-              <w:rPr>
-                <w:sz w:val="20"/>
-              </w:rPr>
-              <w:t>• GL reconciled manually against physical DR/CR copies.</w:t>
-            </w:r>
-          </w:p>
-          <w:p>
-            <w:r>
-              <w:rPr>
-                <w:sz w:val="20"/>
-              </w:rPr>
-              <w:t>• Gains keyed manually - once to Google Sheets, formula and total reviews needed</w:t>
-            </w:r>
-          </w:p>
-          <w:p>
-            <w:r>
-              <w:rPr>
-                <w:sz w:val="20"/>
-              </w:rPr>
-              <w:t>• Residue judged by the driver/helper at point of delivery.</w:t>
-            </w:r>
-          </w:p>
-        </w:tc>
-        <w:tc>
-          <w:tcPr>
-            <w:tcW w:type="dxa" w:w="4320"/>
-          </w:tcPr>
-          <w:p>
-            <w:r/>
-            <w:r>
-              <w:rPr>
-                <w:sz w:val="20"/>
-              </w:rPr>
-              <w:t>• Odoo Sales Order auto-generates Sales Quotation, Picklist, DR. Add the Invoice, Client’s Credit Notes and Team’s Incentive (also under Credit Notes) and GL, in one continuous workflow.</w:t>
-            </w:r>
-          </w:p>
-          <w:p>
-            <w:r>
-              <w:rPr>
-                <w:sz w:val="20"/>
-              </w:rPr>
-              <w:t>• Paper DR and CR with client signature (same as current)</w:t>
-            </w:r>
-          </w:p>
-          <w:p>
-            <w:r>
-              <w:rPr>
-                <w:sz w:val="20"/>
-              </w:rPr>
-              <w:t>• Gains keyed once in Odoo Sales Order. Auto-computes gains for summary, and team incentive.</w:t>
-            </w:r>
-          </w:p>
-          <w:p>
-            <w:r>
-              <w:rPr>
-                <w:sz w:val="20"/>
-              </w:rPr>
-              <w:t>• Single-entry GL posting, removing the GSheet/ACCPAC duplicate entry.</w:t>
-            </w:r>
-          </w:p>
-        </w:tc>
-      </w:tr>
-    </w:tbl>
+    <w:p>
+      <w:pPr>
+        <w:pStyle w:val="Heading4"/>
+      </w:pPr>
+      <w:r>
+        <w:rPr>
+          <w:color w:val="B96B13"/>
+        </w:rPr>
+        <w:t xml:space="preserve">Current — </w:t>
+      </w:r>
+    </w:p>
+    <w:p>
+      <w:pPr>
+        <w:pStyle w:val="ListBullet"/>
+      </w:pPr>
+      <w:r>
+        <w:t>Paper DR/CR forms filled by hand at warehouse and client site.</w:t>
+      </w:r>
+    </w:p>
+    <w:p>
+      <w:pPr>
+        <w:pStyle w:val="ListBullet"/>
+      </w:pPr>
+      <w:r>
+        <w:t>GL reconciled manually against physical DR/</w:t>
+      </w:r>
+      <w:r>
+        <w:t>CR</w:t>
+      </w:r>
+      <w:r>
+        <w:t xml:space="preserve"> copies.</w:t>
+      </w:r>
+    </w:p>
+    <w:p>
+      <w:pPr>
+        <w:pStyle w:val="ListBullet"/>
+      </w:pPr>
+      <w:r>
+        <w:t xml:space="preserve">Gains </w:t>
+      </w:r>
+      <w:r>
+        <w:t>keyed manually</w:t>
+      </w:r>
+      <w:r>
+        <w:t xml:space="preserve"> - once to Google Sheets, </w:t>
+      </w:r>
+      <w:r>
+        <w:t>formula and total reviews needed</w:t>
+      </w:r>
+    </w:p>
+    <w:p>
+      <w:pPr>
+        <w:pStyle w:val="ListBullet"/>
+      </w:pPr>
+      <w:r>
+        <w:t>Residue judged by the driver/</w:t>
+      </w:r>
+      <w:r>
+        <w:t>helper</w:t>
+      </w:r>
+      <w:r>
+        <w:t xml:space="preserve"> at point of delivery.</w:t>
+      </w:r>
+    </w:p>
+    <w:p>
+      <w:pPr>
+        <w:pStyle w:val="Heading4"/>
+      </w:pPr>
+      <w:r>
+        <w:rPr>
+          <w:color w:val="B96B13"/>
+        </w:rPr>
+        <w:t>Future —</w:t>
+      </w:r>
+    </w:p>
+    <w:p>
+      <w:pPr>
+        <w:pStyle w:val="ListBullet"/>
+      </w:pPr>
+      <w:r>
+        <w:t xml:space="preserve">Odoo Sales Order auto-generates </w:t>
+      </w:r>
+      <w:r>
+        <w:t xml:space="preserve">Sales Quotation, </w:t>
+      </w:r>
+      <w:r>
+        <w:t>Picklist, DR</w:t>
+      </w:r>
+      <w:r>
+        <w:t>. Add the Invoice, Client’s Credit Notes and Team’s Incentive (also under Credit Notes) and GL, in one continuous workflow.</w:t>
+      </w:r>
+    </w:p>
+    <w:p>
+      <w:pPr>
+        <w:pStyle w:val="ListBullet"/>
+      </w:pPr>
+      <w:r>
+        <w:t>Paper DR and CR with client signature (same as current)</w:t>
+      </w:r>
+    </w:p>
+    <w:p>
+      <w:pPr>
+        <w:pStyle w:val="ListBullet"/>
+      </w:pPr>
+      <w:r>
+        <w:t>Gains keyed once in Odoo Sales Order. Auto-computes gains for summary, and team incentive.</w:t>
+      </w:r>
+    </w:p>
+    <w:p>
+      <w:pPr>
+        <w:pStyle w:val="ListBullet"/>
+      </w:pPr>
+      <w:r>
+        <w:t>Single-entry GL posting, removing the GSheet/ACCPAC duplicate entry.</w:t>
+      </w:r>
+    </w:p>
     <w:p>
       <w:pPr>
         <w:pStyle w:val="Heading2"/>
@@ -3039,112 +3033,100 @@
         <w:t>Current vs. Future Workflow</w:t>
       </w:r>
     </w:p>
-    <w:tbl>
-      <w:tblPr>
-        <w:tblStyle w:val="TableGrid"/>
-        <w:tblW w:type="auto" w:w="0"/>
-        <w:tblLayout w:type="autofit"/>
-        <w:tblLook w:firstColumn="1" w:firstRow="1" w:lastColumn="0" w:lastRow="0" w:noHBand="0" w:noVBand="1" w:val="04A0"/>
-      </w:tblPr>
-      <w:tblGrid>
-        <w:gridCol w:w="4320"/>
-        <w:gridCol w:w="4320"/>
-      </w:tblGrid>
-      <w:tr>
-        <w:tc>
-          <w:tcPr>
-            <w:tcW w:type="dxa" w:w="4320"/>
-            <w:shd w:val="clear" w:color="auto" w:fill="DCEAF5"/>
-          </w:tcPr>
-          <w:p>
-            <w:r/>
-            <w:r>
-              <w:rPr>
-                <w:b/>
-              </w:rPr>
-              <w:t>Current Workflow</w:t>
-            </w:r>
-          </w:p>
-        </w:tc>
-        <w:tc>
-          <w:tcPr>
-            <w:tcW w:type="dxa" w:w="4320"/>
-            <w:shd w:val="clear" w:color="auto" w:fill="DCEAF5"/>
-          </w:tcPr>
-          <w:p>
-            <w:r/>
-            <w:r>
-              <w:rPr>
-                <w:b/>
-              </w:rPr>
-              <w:t>Future Workflow</w:t>
-            </w:r>
-          </w:p>
-        </w:tc>
-      </w:tr>
-      <w:tr>
-        <w:tc>
-          <w:tcPr>
-            <w:tcW w:type="dxa" w:w="4320"/>
-          </w:tcPr>
-          <w:p>
-            <w:r/>
-            <w:r>
-              <w:rPr>
-                <w:sz w:val="20"/>
-              </w:rPr>
-              <w:t>• Truck-scale readings and Meter/gauge reading logged by hand on paper slips.</w:t>
-            </w:r>
-          </w:p>
-          <w:p>
-            <w:r>
-              <w:rPr>
-                <w:sz w:val="20"/>
-              </w:rPr>
-              <w:t>• Per-truck gain calculated by comparing two paper slips.</w:t>
-            </w:r>
-          </w:p>
-        </w:tc>
-        <w:tc>
-          <w:tcPr>
-            <w:tcW w:type="dxa" w:w="4320"/>
-          </w:tcPr>
-          <w:p>
-            <w:r/>
-            <w:r>
-              <w:rPr>
-                <w:sz w:val="20"/>
-              </w:rPr>
-              <w:t>• Odoo Inventory stock-transfer module logs tank-to-truck and truck-to-tank movements with digital/hardcopy/summary/individual versions.</w:t>
-            </w:r>
-          </w:p>
-          <w:p>
-            <w:r>
-              <w:rPr>
-                <w:sz w:val="20"/>
-              </w:rPr>
-              <w:t>• Gains and residue computations summary are automatic from individual transactions.</w:t>
-            </w:r>
-          </w:p>
-          <w:p>
-            <w:r>
-              <w:rPr>
-                <w:sz w:val="20"/>
-              </w:rPr>
-              <w:t>• Gains per sales order are encoded as Credit Notes, smooth gains computation.</w:t>
-            </w:r>
-          </w:p>
-          <w:p>
-            <w:r>
-              <w:rPr>
-                <w:sz w:val="20"/>
-              </w:rPr>
-              <w:t>• Auto-flagged gain/loss variance per truck, no manual comparison.</w:t>
-            </w:r>
-          </w:p>
-        </w:tc>
-      </w:tr>
-    </w:tbl>
+    <w:p>
+      <w:pPr>
+        <w:pStyle w:val="Heading4"/>
+      </w:pPr>
+      <w:r>
+        <w:rPr>
+          <w:color w:val="B96B13"/>
+        </w:rPr>
+        <w:t xml:space="preserve">Current — </w:t>
+      </w:r>
+    </w:p>
+    <w:p>
+      <w:pPr>
+        <w:pStyle w:val="ListBullet"/>
+      </w:pPr>
+      <w:r>
+        <w:t>Truck-scale readings</w:t>
+      </w:r>
+      <w:r>
+        <w:t xml:space="preserve"> and Meter/gauge reading</w:t>
+      </w:r>
+      <w:r>
+        <w:t xml:space="preserve"> logged by hand on paper slip</w:t>
+      </w:r>
+      <w:r>
+        <w:t>s.</w:t>
+      </w:r>
+    </w:p>
+    <w:p>
+      <w:pPr>
+        <w:pStyle w:val="ListBullet"/>
+      </w:pPr>
+      <w:r>
+        <w:t>Per-truck gain calculated by comparing two paper slips.</w:t>
+      </w:r>
+    </w:p>
+    <w:p>
+      <w:pPr>
+        <w:pStyle w:val="Heading4"/>
+      </w:pPr>
+      <w:r>
+        <w:rPr>
+          <w:color w:val="B96B13"/>
+        </w:rPr>
+        <w:t xml:space="preserve">Future — </w:t>
+      </w:r>
+    </w:p>
+    <w:p>
+      <w:pPr>
+        <w:pStyle w:val="ListBullet"/>
+      </w:pPr>
+      <w:r>
+        <w:t xml:space="preserve">Odoo Inventory stock-transfer module logs tank-to-truck </w:t>
+      </w:r>
+      <w:r>
+        <w:t xml:space="preserve">and truck-to-tank </w:t>
+      </w:r>
+      <w:r>
+        <w:t>movement</w:t>
+      </w:r>
+      <w:r>
+        <w:t>s</w:t>
+      </w:r>
+      <w:r>
+        <w:t xml:space="preserve"> </w:t>
+      </w:r>
+      <w:r>
+        <w:t>with digital/hardcopy/summary/individual versions.</w:t>
+      </w:r>
+    </w:p>
+    <w:p>
+      <w:pPr>
+        <w:pStyle w:val="ListBullet"/>
+      </w:pPr>
+      <w:r>
+        <w:t>Gains and residue computations summary are automatic from individual transactions.</w:t>
+      </w:r>
+    </w:p>
+    <w:p>
+      <w:pPr>
+        <w:pStyle w:val="ListBullet"/>
+      </w:pPr>
+      <w:r>
+        <w:t>Gains per sales order are encoded as Credit Notes, smooth gains computation.</w:t>
+      </w:r>
+    </w:p>
+    <w:p>
+      <w:pPr>
+        <w:pStyle w:val="ListBullet"/>
+      </w:pPr>
+      <w:r>
+        <w:t>Auto-flagged gain/loss variance per truck, no manual comparison.</w:t>
+      </w:r>
+    </w:p>
     <w:p>
       <w:pPr>
         <w:pStyle w:val="ListBullet"/>
@@ -5411,128 +5393,104 @@
         <w:t>Current vs. Future Workflow</w:t>
       </w:r>
     </w:p>
-    <w:tbl>
-      <w:tblPr>
-        <w:tblStyle w:val="TableGrid"/>
-        <w:tblW w:type="auto" w:w="0"/>
-        <w:tblLayout w:type="autofit"/>
-        <w:tblLook w:firstColumn="1" w:firstRow="1" w:lastColumn="0" w:lastRow="0" w:noHBand="0" w:noVBand="1" w:val="04A0"/>
-      </w:tblPr>
-      <w:tblGrid>
-        <w:gridCol w:w="4320"/>
-        <w:gridCol w:w="4320"/>
-      </w:tblGrid>
-      <w:tr>
-        <w:tc>
-          <w:tcPr>
-            <w:tcW w:type="dxa" w:w="4320"/>
-            <w:shd w:val="clear" w:color="auto" w:fill="DCEAF5"/>
-          </w:tcPr>
-          <w:p>
-            <w:r/>
-            <w:r>
-              <w:rPr>
-                <w:b/>
-              </w:rPr>
-              <w:t>Current Workflow</w:t>
-            </w:r>
-          </w:p>
-        </w:tc>
-        <w:tc>
-          <w:tcPr>
-            <w:tcW w:type="dxa" w:w="4320"/>
-            <w:shd w:val="clear" w:color="auto" w:fill="DCEAF5"/>
-          </w:tcPr>
-          <w:p>
-            <w:r/>
-            <w:r>
-              <w:rPr>
-                <w:b/>
-              </w:rPr>
-              <w:t>Future Workflow</w:t>
-            </w:r>
-          </w:p>
-        </w:tc>
-      </w:tr>
-      <w:tr>
-        <w:tc>
-          <w:tcPr>
-            <w:tcW w:type="dxa" w:w="4320"/>
-          </w:tcPr>
-          <w:p>
-            <w:r/>
-            <w:r>
-              <w:rPr>
-                <w:sz w:val="20"/>
-              </w:rPr>
-              <w:t>• Gauge readings and RR logged on paper / Google Sheets.</w:t>
-            </w:r>
-          </w:p>
-          <w:p>
-            <w:r>
-              <w:rPr>
-                <w:sz w:val="20"/>
-              </w:rPr>
-              <w:t>• FIFO sequencing tracked manually by staff log sheets.</w:t>
-            </w:r>
-          </w:p>
-          <w:p>
-            <w:r>
-              <w:rPr>
-                <w:sz w:val="20"/>
-              </w:rPr>
-              <w:t>• Cylinder lifespan tracked in a spreadsheet separate from the refilling records.</w:t>
-            </w:r>
-          </w:p>
-        </w:tc>
-        <w:tc>
-          <w:tcPr>
-            <w:tcW w:type="dxa" w:w="4320"/>
-          </w:tcPr>
-          <w:p>
-            <w:r/>
-            <w:r>
-              <w:rPr>
-                <w:sz w:val="20"/>
-              </w:rPr>
-              <w:t>• Gauge readings mobile-encoded, into the Odoo Inventory module.</w:t>
-            </w:r>
-          </w:p>
-          <w:p>
-            <w:r>
-              <w:rPr>
-                <w:sz w:val="20"/>
-              </w:rPr>
-              <w:t>• A single cylinder-asset register linking serial number, batch, refill history, and lifecycle status.</w:t>
-            </w:r>
-          </w:p>
-          <w:p>
-            <w:r>
-              <w:rPr>
-                <w:sz w:val="20"/>
-              </w:rPr>
-              <w:t>• Stock Transfer from Storage Tank to cylinders are mobile-encoded into Odoo Inventory</w:t>
-            </w:r>
-          </w:p>
-          <w:p>
-            <w:r>
-              <w:rPr>
-                <w:sz w:val="20"/>
-              </w:rPr>
-              <w:t>• Cylinder lifespan tracked in Odoo Manufacturing/Inventory modules.</w:t>
-            </w:r>
-          </w:p>
-          <w:p>
-            <w:r>
-              <w:rPr>
-                <w:sz w:val="20"/>
-              </w:rPr>
-              <w:t>• FIFO sequencing tracked manually by staff log sheets.</w:t>
-            </w:r>
-          </w:p>
-        </w:tc>
-      </w:tr>
-    </w:tbl>
+    <w:p>
+      <w:pPr>
+        <w:pStyle w:val="Heading4"/>
+      </w:pPr>
+      <w:r>
+        <w:rPr>
+          <w:color w:val="B96B13"/>
+        </w:rPr>
+        <w:t xml:space="preserve">Current — </w:t>
+      </w:r>
+    </w:p>
+    <w:p>
+      <w:pPr>
+        <w:pStyle w:val="ListBullet"/>
+      </w:pPr>
+      <w:r>
+        <w:t>Gauge readings and RR logged on paper / Google Sheets.</w:t>
+      </w:r>
+    </w:p>
+    <w:p>
+      <w:pPr>
+        <w:pStyle w:val="ListBullet"/>
+      </w:pPr>
+      <w:r>
+        <w:t>FIFO sequencing tracked manually by staff log sheets.</w:t>
+      </w:r>
+    </w:p>
+    <w:p>
+      <w:pPr>
+        <w:pStyle w:val="ListBullet"/>
+      </w:pPr>
+      <w:r>
+        <w:t>Cylinder lifespan tracked in a spreadsheet separate from the refilling records.</w:t>
+      </w:r>
+    </w:p>
+    <w:p>
+      <w:pPr>
+        <w:pStyle w:val="Heading4"/>
+      </w:pPr>
+      <w:r>
+        <w:rPr>
+          <w:color w:val="B96B13"/>
+        </w:rPr>
+        <w:t xml:space="preserve">Future — </w:t>
+      </w:r>
+    </w:p>
+    <w:p>
+      <w:pPr>
+        <w:pStyle w:val="ListBullet"/>
+      </w:pPr>
+      <w:r>
+        <w:t>Gauge readings</w:t>
+      </w:r>
+      <w:r>
+        <w:t xml:space="preserve"> </w:t>
+      </w:r>
+      <w:r>
+        <w:t>mobile-encoded,</w:t>
+      </w:r>
+      <w:r>
+        <w:t xml:space="preserve"> into the Odoo Inventory module.</w:t>
+      </w:r>
+    </w:p>
+    <w:p>
+      <w:pPr>
+        <w:pStyle w:val="ListBullet"/>
+      </w:pPr>
+      <w:r>
+        <w:t>A single cylinder-asset register linking serial number, batch, refill history, and lifecycle status.</w:t>
+      </w:r>
+    </w:p>
+    <w:p>
+      <w:pPr>
+        <w:pStyle w:val="ListBullet"/>
+      </w:pPr>
+      <w:r>
+        <w:t>Stock Transfer from Storage Tank to cylinders are mobile-encoded into Odoo Inventory</w:t>
+      </w:r>
+    </w:p>
+    <w:p>
+      <w:pPr>
+        <w:pStyle w:val="ListBullet"/>
+      </w:pPr>
+      <w:r>
+        <w:t xml:space="preserve">Cylinder lifespan tracked in </w:t>
+      </w:r>
+      <w:r>
+        <w:t>Odoo Manufacturing/Inventory modules.</w:t>
+      </w:r>
+    </w:p>
+    <w:p>
+      <w:pPr>
+        <w:pStyle w:val="ListBullet"/>
+      </w:pPr>
+      <w:r>
+        <w:t>FIFO sequencing tracked manually by staff log sheets.</w:t>
+      </w:r>
+    </w:p>
     <w:p>
       <w:pPr>
         <w:pStyle w:val="Heading2"/>
@@ -6680,80 +6638,44 @@
         <w:t>Current vs. Future Workflow</w:t>
       </w:r>
     </w:p>
-    <w:tbl>
-      <w:tblPr>
-        <w:tblStyle w:val="TableGrid"/>
-        <w:tblW w:type="auto" w:w="0"/>
-        <w:tblLayout w:type="autofit"/>
-        <w:tblLook w:firstColumn="1" w:firstRow="1" w:lastColumn="0" w:lastRow="0" w:noHBand="0" w:noVBand="1" w:val="04A0"/>
-      </w:tblPr>
-      <w:tblGrid>
-        <w:gridCol w:w="4320"/>
-        <w:gridCol w:w="4320"/>
-      </w:tblGrid>
-      <w:tr>
-        <w:tc>
-          <w:tcPr>
-            <w:tcW w:type="dxa" w:w="4320"/>
-            <w:shd w:val="clear" w:color="auto" w:fill="DCEAF5"/>
-          </w:tcPr>
-          <w:p>
-            <w:r/>
-            <w:r>
-              <w:rPr>
-                <w:b/>
-              </w:rPr>
-              <w:t>Current Workflow</w:t>
-            </w:r>
-          </w:p>
-        </w:tc>
-        <w:tc>
-          <w:tcPr>
-            <w:tcW w:type="dxa" w:w="4320"/>
-            <w:shd w:val="clear" w:color="auto" w:fill="DCEAF5"/>
-          </w:tcPr>
-          <w:p>
-            <w:r/>
-            <w:r>
-              <w:rPr>
-                <w:b/>
-              </w:rPr>
-              <w:t>Future Workflow</w:t>
-            </w:r>
-          </w:p>
-        </w:tc>
-      </w:tr>
-      <w:tr>
-        <w:tc>
-          <w:tcPr>
-            <w:tcW w:type="dxa" w:w="4320"/>
-          </w:tcPr>
-          <w:p>
-            <w:r/>
-            <w:r>
-              <w:rPr>
-                <w:sz w:val="20"/>
-              </w:rPr>
-              <w:t>xxx</w:t>
-            </w:r>
-          </w:p>
-        </w:tc>
-        <w:tc>
-          <w:tcPr>
-            <w:tcW w:type="dxa" w:w="4320"/>
-          </w:tcPr>
-          <w:p>
-            <w:r/>
-            <w:r>
-              <w:rPr>
-                <w:sz w:val="20"/>
-              </w:rPr>
-              <w:t>Odoo Sales module. It includes continuous workflow with Pick List, Delivery Receipt, Daily Price List Matrix and Invoice, Credit Notes.</w:t>
-            </w:r>
-          </w:p>
-        </w:tc>
-      </w:tr>
-    </w:tbl>
+    <w:p>
+      <w:pPr>
+        <w:pStyle w:val="Heading4"/>
+      </w:pPr>
+      <w:r>
+        <w:rPr>
+          <w:color w:val="B96B13"/>
+        </w:rPr>
+        <w:t>Current — Traditional / Manual</w:t>
+      </w:r>
+    </w:p>
+    <w:p>
+      <w:pPr>
+        <w:pStyle w:val="ListBullet"/>
+      </w:pPr>
+      <w:r>
+        <w:t>xxx</w:t>
+      </w:r>
+    </w:p>
+    <w:p>
+      <w:pPr>
+        <w:pStyle w:val="Heading4"/>
+      </w:pPr>
+      <w:r>
+        <w:rPr>
+          <w:color w:val="B96B13"/>
+        </w:rPr>
+        <w:t>Future — Target / Automated</w:t>
+      </w:r>
+    </w:p>
+    <w:p>
+      <w:pPr>
+        <w:pStyle w:val="ListBullet"/>
+      </w:pPr>
+      <w:r>
+        <w:t>Odoo Sales module. It includes continuous workflow with Pick List, Delivery Receipt, Daily Price List Matrix and Invoice, Credit Notes.</w:t>
+      </w:r>
+    </w:p>
     <w:p>
       <w:pPr>
         <w:pStyle w:val="Heading2"/>
@@ -7060,80 +6982,47 @@
         <w:t>Current vs. Future Workflow</w:t>
       </w:r>
     </w:p>
-    <w:tbl>
-      <w:tblPr>
-        <w:tblStyle w:val="TableGrid"/>
-        <w:tblW w:type="auto" w:w="0"/>
-        <w:tblLayout w:type="autofit"/>
-        <w:tblLook w:firstColumn="1" w:firstRow="1" w:lastColumn="0" w:lastRow="0" w:noHBand="0" w:noVBand="1" w:val="04A0"/>
-      </w:tblPr>
-      <w:tblGrid>
-        <w:gridCol w:w="4320"/>
-        <w:gridCol w:w="4320"/>
-      </w:tblGrid>
-      <w:tr>
-        <w:tc>
-          <w:tcPr>
-            <w:tcW w:type="dxa" w:w="4320"/>
-            <w:shd w:val="clear" w:color="auto" w:fill="DCEAF5"/>
-          </w:tcPr>
-          <w:p>
-            <w:r/>
-            <w:r>
-              <w:rPr>
-                <w:b/>
-              </w:rPr>
-              <w:t>Current Workflow</w:t>
-            </w:r>
-          </w:p>
-        </w:tc>
-        <w:tc>
-          <w:tcPr>
-            <w:tcW w:type="dxa" w:w="4320"/>
-            <w:shd w:val="clear" w:color="auto" w:fill="DCEAF5"/>
-          </w:tcPr>
-          <w:p>
-            <w:r/>
-            <w:r>
-              <w:rPr>
-                <w:b/>
-              </w:rPr>
-              <w:t>Future Workflow</w:t>
-            </w:r>
-          </w:p>
-        </w:tc>
-      </w:tr>
-      <w:tr>
-        <w:tc>
-          <w:tcPr>
-            <w:tcW w:type="dxa" w:w="4320"/>
-          </w:tcPr>
-          <w:p>
-            <w:r/>
-            <w:r>
-              <w:rPr>
-                <w:sz w:val="20"/>
-              </w:rPr>
-              <w:t>Bulk sales recorded in Gsheet. Sales Orders are excel or manually produced.</w:t>
-            </w:r>
-          </w:p>
-        </w:tc>
-        <w:tc>
-          <w:tcPr>
-            <w:tcW w:type="dxa" w:w="4320"/>
-          </w:tcPr>
-          <w:p>
-            <w:r/>
-            <w:r>
-              <w:rPr>
-                <w:sz w:val="20"/>
-              </w:rPr>
-              <w:t>Same treatment as Commercial.</w:t>
-            </w:r>
-          </w:p>
-        </w:tc>
-      </w:tr>
-    </w:tbl>
+    <w:p>
+      <w:pPr>
+        <w:pStyle w:val="Heading4"/>
+      </w:pPr>
+      <w:r>
+        <w:rPr>
+          <w:color w:val="B96B13"/>
+        </w:rPr>
+        <w:t>Current — Traditional / Manual</w:t>
+      </w:r>
+    </w:p>
+    <w:p>
+      <w:pPr>
+        <w:pStyle w:val="ListBullet"/>
+      </w:pPr>
+      <w:r>
+        <w:t xml:space="preserve">Bulk sales </w:t>
+      </w:r>
+      <w:r>
+        <w:t>recorded in Gsheet. Sales Orders are excel or manually produced.</w:t>
+      </w:r>
+    </w:p>
+    <w:p>
+      <w:pPr>
+        <w:pStyle w:val="Heading4"/>
+      </w:pPr>
+      <w:r>
+        <w:rPr>
+          <w:color w:val="B96B13"/>
+        </w:rPr>
+        <w:t>Future — Target / Automated</w:t>
+      </w:r>
+    </w:p>
+    <w:p>
+      <w:pPr>
+        <w:pStyle w:val="ListBullet"/>
+      </w:pPr>
+      <w:r>
+        <w:t>Same treatment as Commercial.</w:t>
+      </w:r>
+    </w:p>
     <w:p>
       <w:pPr>
         <w:pStyle w:val="Heading2"/>
@@ -9608,88 +9497,52 @@
         <w:t>Current vs. Future Workflow</w:t>
       </w:r>
     </w:p>
-    <w:tbl>
-      <w:tblPr>
-        <w:tblStyle w:val="TableGrid"/>
-        <w:tblW w:type="auto" w:w="0"/>
-        <w:tblLayout w:type="autofit"/>
-        <w:tblLook w:firstColumn="1" w:firstRow="1" w:lastColumn="0" w:lastRow="0" w:noHBand="0" w:noVBand="1" w:val="04A0"/>
-      </w:tblPr>
-      <w:tblGrid>
-        <w:gridCol w:w="4320"/>
-        <w:gridCol w:w="4320"/>
-      </w:tblGrid>
-      <w:tr>
-        <w:tc>
-          <w:tcPr>
-            <w:tcW w:type="dxa" w:w="4320"/>
-            <w:shd w:val="clear" w:color="auto" w:fill="DCEAF5"/>
-          </w:tcPr>
-          <w:p>
-            <w:r/>
-            <w:r>
-              <w:rPr>
-                <w:b/>
-              </w:rPr>
-              <w:t>Current Workflow</w:t>
-            </w:r>
-          </w:p>
-        </w:tc>
-        <w:tc>
-          <w:tcPr>
-            <w:tcW w:type="dxa" w:w="4320"/>
-            <w:shd w:val="clear" w:color="auto" w:fill="DCEAF5"/>
-          </w:tcPr>
-          <w:p>
-            <w:r/>
-            <w:r>
-              <w:rPr>
-                <w:b/>
-              </w:rPr>
-              <w:t>Future Workflow</w:t>
-            </w:r>
-          </w:p>
-        </w:tc>
-      </w:tr>
-      <w:tr>
-        <w:tc>
-          <w:tcPr>
-            <w:tcW w:type="dxa" w:w="4320"/>
-          </w:tcPr>
-          <w:p>
-            <w:r/>
-            <w:r>
-              <w:rPr>
-                <w:sz w:val="20"/>
-              </w:rPr>
-              <w:t>• Price cascade is confirmed via email and informal notification to several separate people</w:t>
-            </w:r>
-          </w:p>
-          <w:p>
-            <w:r>
-              <w:rPr>
-                <w:sz w:val="20"/>
-              </w:rPr>
-              <w:t>• Sales Quota tracking has several Data Output fields</w:t>
-            </w:r>
-          </w:p>
-        </w:tc>
-        <w:tc>
-          <w:tcPr>
-            <w:tcW w:type="dxa" w:w="4320"/>
-          </w:tcPr>
-          <w:p>
-            <w:r/>
-            <w:r>
-              <w:rPr>
-                <w:sz w:val="20"/>
-              </w:rPr>
-              <w:t>A single Pricing Matrix dashboard (already partially specified) that shows cascade status per channel instead of relying on the Regional Sales Manager's memory of who's been notified.</w:t>
-            </w:r>
-          </w:p>
-        </w:tc>
-      </w:tr>
-    </w:tbl>
+    <w:p>
+      <w:pPr>
+        <w:pStyle w:val="Heading4"/>
+      </w:pPr>
+      <w:r>
+        <w:rPr>
+          <w:color w:val="B96B13"/>
+        </w:rPr>
+        <w:t>Current — Traditional / Manual</w:t>
+      </w:r>
+    </w:p>
+    <w:p>
+      <w:pPr>
+        <w:pStyle w:val="ListBullet"/>
+      </w:pPr>
+      <w:r>
+        <w:t>Price cascade is confirmed via email and informal notification to several separate people</w:t>
+      </w:r>
+    </w:p>
+    <w:p>
+      <w:pPr>
+        <w:pStyle w:val="ListBullet"/>
+      </w:pPr>
+      <w:r>
+        <w:t>Sales Quota tracking has several Data Output fields</w:t>
+      </w:r>
+    </w:p>
+    <w:p>
+      <w:pPr>
+        <w:pStyle w:val="Heading4"/>
+      </w:pPr>
+      <w:r>
+        <w:rPr>
+          <w:color w:val="B96B13"/>
+        </w:rPr>
+        <w:t>Future — Target / Automated</w:t>
+      </w:r>
+    </w:p>
+    <w:p>
+      <w:pPr>
+        <w:pStyle w:val="ListBullet"/>
+      </w:pPr>
+      <w:r>
+        <w:t>A single Pricing Matrix dashboard (already partially specified) that shows cascade status per channel instead of relying on the Regional Sales Manager's memory of who's been notified.</w:t>
+      </w:r>
+    </w:p>
     <w:p>
       <w:r>
         <w:rPr>
@@ -10721,96 +10574,60 @@
         <w:t>Current vs. Future Workflow</w:t>
       </w:r>
     </w:p>
-    <w:tbl>
-      <w:tblPr>
-        <w:tblStyle w:val="TableGrid"/>
-        <w:tblW w:type="auto" w:w="0"/>
-        <w:tblLayout w:type="autofit"/>
-        <w:tblLook w:firstColumn="1" w:firstRow="1" w:lastColumn="0" w:lastRow="0" w:noHBand="0" w:noVBand="1" w:val="04A0"/>
-      </w:tblPr>
-      <w:tblGrid>
-        <w:gridCol w:w="4320"/>
-        <w:gridCol w:w="4320"/>
-      </w:tblGrid>
-      <w:tr>
-        <w:tc>
-          <w:tcPr>
-            <w:tcW w:type="dxa" w:w="4320"/>
-            <w:shd w:val="clear" w:color="auto" w:fill="DCEAF5"/>
-          </w:tcPr>
-          <w:p>
-            <w:r/>
-            <w:r>
-              <w:rPr>
-                <w:b/>
-              </w:rPr>
-              <w:t>Current Workflow</w:t>
-            </w:r>
-          </w:p>
-        </w:tc>
-        <w:tc>
-          <w:tcPr>
-            <w:tcW w:type="dxa" w:w="4320"/>
-            <w:shd w:val="clear" w:color="auto" w:fill="DCEAF5"/>
-          </w:tcPr>
-          <w:p>
-            <w:r/>
-            <w:r>
-              <w:rPr>
-                <w:b/>
-              </w:rPr>
-              <w:t>Future Workflow</w:t>
-            </w:r>
-          </w:p>
-        </w:tc>
-      </w:tr>
-      <w:tr>
-        <w:tc>
-          <w:tcPr>
-            <w:tcW w:type="dxa" w:w="4320"/>
-          </w:tcPr>
-          <w:p>
-            <w:r/>
-            <w:r>
-              <w:rPr>
-                <w:sz w:val="20"/>
-              </w:rPr>
-              <w:t>• Aged Receivables and Write-off summaries are printed, not dashboarded - a stale figure is possible between print runs.</w:t>
-            </w:r>
-          </w:p>
-          <w:p>
-            <w:r>
-              <w:rPr>
-                <w:sz w:val="20"/>
-              </w:rPr>
-              <w:t>• Dispute resolution travels as a physical paper submission to a superior.</w:t>
-            </w:r>
-          </w:p>
-        </w:tc>
-        <w:tc>
-          <w:tcPr>
-            <w:tcW w:type="dxa" w:w="4320"/>
-          </w:tcPr>
-          <w:p>
-            <w:r/>
-            <w:r>
-              <w:rPr>
-                <w:sz w:val="20"/>
-              </w:rPr>
-              <w:t>• Real-time AR aging visible on demand instead of a monthly print cycle.</w:t>
-            </w:r>
-          </w:p>
-          <w:p>
-            <w:r>
-              <w:rPr>
-                <w:sz w:val="20"/>
-              </w:rPr>
-              <w:t>• Digital dispute log with status tracking instead of a paper hand-off.</w:t>
-            </w:r>
-          </w:p>
-        </w:tc>
-      </w:tr>
-    </w:tbl>
+    <w:p>
+      <w:pPr>
+        <w:pStyle w:val="Heading4"/>
+      </w:pPr>
+      <w:r>
+        <w:rPr>
+          <w:color w:val="B96B13"/>
+        </w:rPr>
+        <w:t>Current — Traditional / Manual</w:t>
+      </w:r>
+    </w:p>
+    <w:p>
+      <w:pPr>
+        <w:pStyle w:val="ListBullet"/>
+      </w:pPr>
+      <w:r>
+        <w:t>Aged Receivables and Write-off summaries are printed, not dashboarded - a stale figure is possible between print runs.</w:t>
+      </w:r>
+    </w:p>
+    <w:p>
+      <w:pPr>
+        <w:pStyle w:val="ListBullet"/>
+      </w:pPr>
+      <w:r>
+        <w:t>Dispute resolution travels as a physical paper submission to a superior.</w:t>
+      </w:r>
+    </w:p>
+    <w:p>
+      <w:pPr>
+        <w:pStyle w:val="Heading4"/>
+      </w:pPr>
+      <w:r>
+        <w:rPr>
+          <w:color w:val="B96B13"/>
+        </w:rPr>
+        <w:t>Future — Target / Automated</w:t>
+      </w:r>
+    </w:p>
+    <w:p>
+      <w:pPr>
+        <w:pStyle w:val="ListBullet"/>
+      </w:pPr>
+      <w:r>
+        <w:t>Real-time AR aging visible on demand instead of a monthly print cycle.</w:t>
+      </w:r>
+    </w:p>
+    <w:p>
+      <w:pPr>
+        <w:pStyle w:val="ListBullet"/>
+      </w:pPr>
+      <w:r>
+        <w:t>Digital dispute log with status tracking instead of a paper hand-off.</w:t>
+      </w:r>
+    </w:p>
     <w:p>
       <w:r>
         <w:rPr>
@@ -11131,80 +10948,61 @@
         <w:t>Current vs. Future Workflow</w:t>
       </w:r>
     </w:p>
-    <w:tbl>
-      <w:tblPr>
-        <w:tblStyle w:val="TableGrid"/>
-        <w:tblW w:type="auto" w:w="0"/>
-        <w:tblLayout w:type="autofit"/>
-        <w:tblLook w:firstColumn="1" w:firstRow="1" w:lastColumn="0" w:lastRow="0" w:noHBand="0" w:noVBand="1" w:val="04A0"/>
-      </w:tblPr>
-      <w:tblGrid>
-        <w:gridCol w:w="4320"/>
-        <w:gridCol w:w="4320"/>
-      </w:tblGrid>
-      <w:tr>
-        <w:tc>
-          <w:tcPr>
-            <w:tcW w:type="dxa" w:w="4320"/>
-            <w:shd w:val="clear" w:color="auto" w:fill="DCEAF5"/>
-          </w:tcPr>
-          <w:p>
-            <w:r/>
-            <w:r>
-              <w:rPr>
-                <w:b/>
-              </w:rPr>
-              <w:t>Current Workflow</w:t>
-            </w:r>
-          </w:p>
-        </w:tc>
-        <w:tc>
-          <w:tcPr>
-            <w:tcW w:type="dxa" w:w="4320"/>
-            <w:shd w:val="clear" w:color="auto" w:fill="DCEAF5"/>
-          </w:tcPr>
-          <w:p>
-            <w:r/>
-            <w:r>
-              <w:rPr>
-                <w:b/>
-              </w:rPr>
-              <w:t>Future Workflow</w:t>
-            </w:r>
-          </w:p>
-        </w:tc>
-      </w:tr>
-      <w:tr>
-        <w:tc>
-          <w:tcPr>
-            <w:tcW w:type="dxa" w:w="4320"/>
-          </w:tcPr>
-          <w:p>
-            <w:r/>
-            <w:r>
-              <w:rPr>
-                <w:sz w:val="20"/>
-              </w:rPr>
-              <w:t>Bulk accounting handled as an unexceptioned copy of Commercial; per-truck reconciliation differences (Operations &gt; Bulk) are not reflected in the accounting procedure.</w:t>
-            </w:r>
-          </w:p>
-        </w:tc>
-        <w:tc>
-          <w:tcPr>
-            <w:tcW w:type="dxa" w:w="4320"/>
-          </w:tcPr>
-          <w:p>
-            <w:r/>
-            <w:r>
-              <w:rPr>
-                <w:sz w:val="20"/>
-              </w:rPr>
-              <w:t>Confirm and document whether per-truck gain computation requires a distinct AR/bank-rec step, then encode it explicitly.</w:t>
-            </w:r>
-          </w:p>
-        </w:tc>
-      </w:tr>
-    </w:tbl>
+    <w:p>
+      <w:pPr>
+        <w:pStyle w:val="Heading4"/>
+      </w:pPr>
+      <w:r>
+        <w:rPr>
+          <w:color w:val="B96B13"/>
+        </w:rPr>
+        <w:t>Current — Traditional / Manual</w:t>
+      </w:r>
+    </w:p>
+    <w:p>
+      <w:pPr>
+        <w:pStyle w:val="ListBullet"/>
+      </w:pPr>
+      <w:r>
+        <w:t xml:space="preserve">Bulk accounting handled as an unexceptioned copy of Commercial; per-truck reconciliation differences (Operations &gt; </w:t>
+      </w:r>
+      <w:r>
+        <w:t>Bulk</w:t>
+      </w:r>
+      <w:r>
+        <w:t>) are not reflected in the accounting procedure.</w:t>
+      </w:r>
+    </w:p>
+    <w:p>
+      <w:pPr>
+        <w:pStyle w:val="Heading4"/>
+      </w:pPr>
+      <w:r>
+        <w:rPr>
+          <w:color w:val="B96B13"/>
+        </w:rPr>
+        <w:t>Future — Target / Automated</w:t>
+      </w:r>
+    </w:p>
+    <w:p>
+      <w:pPr>
+        <w:pStyle w:val="ListBullet"/>
+      </w:pPr>
+      <w:r>
+        <w:t>Confirm and document whether per-truck gain computation requires a distinct AR/bank-rec step, then encode it explicitly.</w:t>
+      </w:r>
+    </w:p>
+    <w:p>
+      <w:pPr>
+        <w:pStyle w:val="Heading4"/>
+      </w:pPr>
+      <w:r>
+        <w:rPr>
+          <w:color w:val="B42318"/>
+        </w:rPr>
+        <w:t>Gap Note</w:t>
+      </w:r>
+    </w:p>
     <w:p>
       <w:r>
         <w:t>The source site flags this stage as "Same as Acctg Commercial A5</w:t>
@@ -13046,80 +12844,44 @@
         <w:t>Current vs. Future Workflow</w:t>
       </w:r>
     </w:p>
-    <w:tbl>
-      <w:tblPr>
-        <w:tblStyle w:val="TableGrid"/>
-        <w:tblW w:type="auto" w:w="0"/>
-        <w:tblLayout w:type="autofit"/>
-        <w:tblLook w:firstColumn="1" w:firstRow="1" w:lastColumn="0" w:lastRow="0" w:noHBand="0" w:noVBand="1" w:val="04A0"/>
-      </w:tblPr>
-      <w:tblGrid>
-        <w:gridCol w:w="4320"/>
-        <w:gridCol w:w="4320"/>
-      </w:tblGrid>
-      <w:tr>
-        <w:tc>
-          <w:tcPr>
-            <w:tcW w:type="dxa" w:w="4320"/>
-            <w:shd w:val="clear" w:color="auto" w:fill="DCEAF5"/>
-          </w:tcPr>
-          <w:p>
-            <w:r/>
-            <w:r>
-              <w:rPr>
-                <w:b/>
-              </w:rPr>
-              <w:t>Current Workflow</w:t>
-            </w:r>
-          </w:p>
-        </w:tc>
-        <w:tc>
-          <w:tcPr>
-            <w:tcW w:type="dxa" w:w="4320"/>
-            <w:shd w:val="clear" w:color="auto" w:fill="DCEAF5"/>
-          </w:tcPr>
-          <w:p>
-            <w:r/>
-            <w:r>
-              <w:rPr>
-                <w:b/>
-              </w:rPr>
-              <w:t>Future Workflow</w:t>
-            </w:r>
-          </w:p>
-        </w:tc>
-      </w:tr>
-      <w:tr>
-        <w:tc>
-          <w:tcPr>
-            <w:tcW w:type="dxa" w:w="4320"/>
-          </w:tcPr>
-          <w:p>
-            <w:r/>
-            <w:r>
-              <w:rPr>
-                <w:sz w:val="20"/>
-              </w:rPr>
-              <w:t>Statements are printed monthly rather than continuously available; drill-down exists but the base refresh is still a manual, scheduled step.</w:t>
-            </w:r>
-          </w:p>
-        </w:tc>
-        <w:tc>
-          <w:tcPr>
-            <w:tcW w:type="dxa" w:w="4320"/>
-          </w:tcPr>
-          <w:p>
-            <w:r/>
-            <w:r>
-              <w:rPr>
-                <w:sz w:val="20"/>
-              </w:rPr>
-              <w:t>On-demand PDF/Excel exports with live drill-down (already specified as a target feature), so a mid-month check doesn't wait for the scheduled refresh.</w:t>
-            </w:r>
-          </w:p>
-        </w:tc>
-      </w:tr>
-    </w:tbl>
+    <w:p>
+      <w:pPr>
+        <w:pStyle w:val="Heading4"/>
+      </w:pPr>
+      <w:r>
+        <w:rPr>
+          <w:color w:val="B96B13"/>
+        </w:rPr>
+        <w:t>Current — Traditional / Manual</w:t>
+      </w:r>
+    </w:p>
+    <w:p>
+      <w:pPr>
+        <w:pStyle w:val="ListBullet"/>
+      </w:pPr>
+      <w:r>
+        <w:t>Statements are printed monthly rather than continuously available; drill-down exists but the base refresh is still a manual, scheduled step.</w:t>
+      </w:r>
+    </w:p>
+    <w:p>
+      <w:pPr>
+        <w:pStyle w:val="Heading4"/>
+      </w:pPr>
+      <w:r>
+        <w:rPr>
+          <w:color w:val="B96B13"/>
+        </w:rPr>
+        <w:t>Future — Target / Automated</w:t>
+      </w:r>
+    </w:p>
+    <w:p>
+      <w:pPr>
+        <w:pStyle w:val="ListBullet"/>
+      </w:pPr>
+      <w:r>
+        <w:t>On-demand PDF/Excel exports with live drill-down (already specified as a target feature), so a mid-month check doesn't wait for the scheduled refresh.</w:t>
+      </w:r>
+    </w:p>
     <w:p>
       <w:r>
         <w:rPr>

</xml_diff>